<commit_message>
Add verified quantum literature and citations to the English BFG supplement
</commit_message>
<xml_diff>
--- a/papers/relational-composition-2026-09-30/BFG_Relational_Composition_and_Balance_State_2026-09-30.docx
+++ b/papers/relational-composition-2026-09-30/BFG_Relational_Composition_and_Balance_State_2026-09-30.docx
@@ -1526,7 +1526,7 @@
         <w:rPr>
           <w:b w:val="0"/>
         </w:rPr>
-        <w:t>This is the Hilbert–Schmidt metric. R2 is stronger than coordinate covariance: the components of a general metric could transform with the basis. Here, the absence of an additional distinguished endpoint metric is an explicit requirement.</w:t>
+        <w:t>This is the Hilbert–Schmidt metric [6]. R2 is stronger than coordinate covariance: the components of a general metric could transform with the basis. Here, the absence of an additional distinguished endpoint metric is an explicit requirement.</w:t>
       </w:r>
     </w:p>
     <w:p>
@@ -1837,7 +1837,7 @@
         <w:rPr>
           <w:b w:val="0"/>
         </w:rPr>
-        <w:t>The tensor product thus appears as an algebraic representation of the relation space. The second factor is the conjugate carrier because R acts contravariantly at its second endpoint. The superscript c denotes the conjugate carrier or componentwise conjugation. The transpose in the last equation is essential, particularly for the imaginary relation Y.</w:t>
+        <w:t>The tensor product thus appears as an algebraic representation of the relation space. The second factor is the conjugate carrier because R acts contravariantly at its second endpoint. The superscript c denotes the conjugate carrier or componentwise conjugation. The transpose in the last equation is essential, particularly for the imaginary relation Y. These vectorization identities agree with the standard operator–vector correspondence [6, Chapter 1].</w:t>
       </w:r>
     </w:p>
     <w:p>
@@ -2886,7 +2886,7 @@
         <w:rPr>
           <w:b w:val="0"/>
         </w:rPr>
-        <w:t>The normalized coefficient operator has rank two and two equal singular values. A product vector would have a coefficient operator of rank one. The joint vector is therefore nonseparable with respect to the endpoint decomposition obtained from R1, and both algebraic reductions are I/2. Interpreting them as local measurement states additionally requires a statistical assignment.</w:t>
+        <w:t>The normalized coefficient operator has rank two and two equal singular values. A product vector would have a coefficient operator of rank one, as follows from the standard Schmidt decomposition [6]. The joint vector is therefore nonseparable with respect to the endpoint decomposition obtained from R1, and both algebraic reductions are I/2. Interpreting them as local measurement states additionally requires a statistical assignment.</w:t>
       </w:r>
     </w:p>
     <w:p>
@@ -7560,7 +7560,7 @@
         <w:rPr>
           <w:b w:val="0"/>
         </w:rPr>
-        <w:t>Here S_geom denotes C₀₀ + C₀₁ + C₁₀ − C₁₁ for these four geometric values. An experimental CHSH violation additionally requires C to describe correlations of counted individual outcomes. The relation algebra alone does not supply that interpretation.</w:t>
+        <w:t>Here S_geom denotes C₀₀ + C₀₁ + C₁₀ − C₁₁ for these four geometric values. An experimental CHSH violation additionally requires C to describe correlations of counted individual outcomes. The relation algebra alone does not supply that interpretation. The relevant statistical inequality is due to Bell and CHSH [9,10]; the quantum upper bound is 2√2 [11].</w:t>
       </w:r>
     </w:p>
     <w:p>
@@ -7791,7 +7791,7 @@
         <w:rPr>
           <w:b w:val="0"/>
         </w:rPr>
-        <w:t>The earlier measurement model [4] adds two requirements: the probability of an ideal channel depends only on its normalized mass, and a lossless split into orthogonal subchannels preserves the summed probability. Together with normalization and nonnegativity, rational refinement and monotonicity then force p = w. The present composition does not independently establish these statistical requirements.</w:t>
+        <w:t>The earlier measurement model [4] adds two requirements: the probability of an ideal channel depends only on its normalized mass, and a lossless split into orthogonal subchannels preserves the summed probability. Together with normalization and nonnegativity, rational refinement and monotonicity then force p = w. The present composition does not independently establish these statistical requirements. Related probability representation theorems also have explicit measure assumptions [13,14]; Section 9 explains the distinction.</w:t>
       </w:r>
     </w:p>
     <w:p>
@@ -7828,7 +7828,7 @@
         <w:pStyle w:val="Heading1"/>
       </w:pPr>
       <w:r>
-        <w:t>8 Computational verification and sources</w:t>
+        <w:t>8 Computational verification</w:t>
       </w:r>
     </w:p>
     <w:p>
@@ -8410,55 +8410,480 @@
     </w:p>
     <w:p>
       <w:r>
-        <w:rPr>
-          <w:b/>
-        </w:rPr>
-        <w:t>References</w:t>
+        <w:br w:type="page"/>
+      </w:r>
+    </w:p>
+    <w:p>
+      <w:pPr>
+        <w:pStyle w:val="Heading1"/>
+      </w:pPr>
+      <w:r>
+        <w:t>9 Relation to established quantum theory</w:t>
       </w:r>
     </w:p>
     <w:p>
       <w:r>
         <w:rPr>
           <w:b w:val="0"/>
-          <w:sz w:val="18"/>
         </w:rPr>
-        <w:t>[1] Marcel Theodor Wende. Minimal Carrier and Action-Scale Closure in the Balance–Field Framework. 22 September 2026. Especially Sections 2–8 and Appendix A.</w:t>
+        <w:t>Historical context. The EPR paper [7] questioned the completeness of the quantum description through correlations between previously interacting systems. Schrödinger [8] examined joint descriptions and matched observables of separated systems. These papers provide context for the joint-versus-local distinction considered here. Their historical conclusions neither establish the BFG rules R1–R3 nor identify a BFG neutral mechanism.</w:t>
       </w:r>
     </w:p>
     <w:p>
       <w:r>
         <w:rPr>
           <w:b w:val="0"/>
-          <w:sz w:val="18"/>
         </w:rPr>
-        <w:t>[2] Marcel Theodor Wende. BFG Neutral First Reclosure and the Conditions for Emergence. Integrated preprint with amended Level 0, revised 30 September 2026. Especially Section 2.</w:t>
+        <w:t>Mathematical correspondence. Operator vectorization, partial traces, and the connection between singular values and Schmidt coefficients are standard results [6]. The calculation in Sections 2 and 3 uses these identities explicitly. Its BFG-specific proposal is the selection of the admissible relation space, metric, and intertwining condition. For mixed states, entanglement and Bell violation must also be distinguished: Werner constructed entangled states admitting local hidden-variable descriptions for projective measurements [12]. A nonseparability test therefore cannot generally replace a Bell test.</w:t>
       </w:r>
     </w:p>
     <w:p>
       <w:r>
         <w:rPr>
           <w:b w:val="0"/>
-          <w:sz w:val="18"/>
         </w:rPr>
-        <w:t>[3] BFG G0 as a New Continuation Axiom. Justification and Mathematical Consequences of a Revised Neutral Feedback Rule. Prepared for Marcel Theodor Wende, 30 September 2026; with Closed BFG Dynamics with Separate Neutral Load and the unchanged module g0_model.py. Manuscript titles translated from German.</w:t>
+        <w:t>Bell correlation bounds. Bell’s theorem and the CHSH formulation constrain outcome statistics [9,10]. With outcomes ±1, a setting-independent hidden-variable distribution and Bell-local factorization imply |S| ≤ 2. Standard quantum observables satisfy the larger upper bound 2√2 [11]. The geometric value in equation (31) agrees with that bound, but its evaluation alone supplies neither individual outcomes nor an empirical violation. This comparison fixes the benchmark without inserting the quantum measurement rule into the BFG derivation.</w:t>
       </w:r>
     </w:p>
     <w:p>
       <w:r>
         <w:rPr>
           <w:b w:val="0"/>
-          <w:sz w:val="18"/>
         </w:rPr>
-        <w:t>[4] BFG Measurement Model with Neutral Continuation. Balance Coupling, Local Registration, and Conditional Outcome Probabilities. Prepared for Marcel Theodor Wende, 30 September 2026. Especially Sections 2, 4, and 5. Manuscript title translated from German.</w:t>
+        <w:t>Probability representation. Gleason’s theorem represents nonnegative, orthogonally additive measures on Hilbert subspaces by trace expressions in dimension at least three [13]. It does not apply in its original projection-only form to an isolated two-dimensional carrier. Busch obtains a related representation on the larger set of effects, including dimension two, under positivity, normalization, and additivity assumptions [14]. On the four-dimensional composite carrier, a Gleason argument would still require the appropriate probability assignment over its subspaces. Neither theorem derives those statistical premises from R1–R3 or G0. The mass-refinement argument in Section 7 remains the explicitly conditional argument of [4].</w:t>
       </w:r>
     </w:p>
     <w:p>
       <w:r>
         <w:rPr>
           <w:b w:val="0"/>
-          <w:sz w:val="18"/>
+        </w:rPr>
+        <w:t>Experimental comparison. Hensen et al. demonstrated a Bell violation with distant electron spins using an event-ready scheme and explicit control of the detection and locality loopholes [15]. Such work illustrates the difference between evaluating a state formula and testing correlations of recorded trials. A future BFG test would need its own preparation, measurement settings, outcome registration, trial-selection rule, and statistical analysis. The retained G0 witness mass in Section 6 is not yet a physical heralding model.</w:t>
+      </w:r>
+    </w:p>
+    <w:p>
+      <w:r>
+        <w:rPr>
+          <w:b w:val="0"/>
+        </w:rPr>
+        <w:t>Physical mediation. Marletto and Vedral relate the ability of a mediator to generate entanglement to its nonclassical observables under a specified local-interaction arrangement [16]. Their argument excludes a direct interaction between the two quantum endpoints. The BFG operator N used here specifies a neutral load on a relation space; it is not yet a separate physical mediator with independently defined observables and endpoint couplings. Consequently, the present result establishes neither the necessity of a third physical system nor that system’s nonclassicality. Applying a mediator theorem would require those further definitions.</w:t>
+      </w:r>
+    </w:p>
+    <w:p>
+      <w:r>
+        <w:rPr>
+          <w:b w:val="0"/>
+        </w:rPr>
+        <w:t>The external references identify established mathematical tools, statistical assumptions, and experimental standards. They do not alter the conditional proof status of the BFG extension or constitute independent experimental support for it.</w:t>
+      </w:r>
+    </w:p>
+    <w:p>
+      <w:r>
+        <w:br w:type="page"/>
+      </w:r>
+    </w:p>
+    <w:p>
+      <w:pPr>
+        <w:pStyle w:val="Heading1"/>
+      </w:pPr>
+      <w:r>
+        <w:t>10 References</w:t>
+      </w:r>
+    </w:p>
+    <w:p>
+      <w:r>
+        <w:rPr>
+          <w:b/>
+        </w:rPr>
+        <w:t>BFG sources and development manuscripts</w:t>
+      </w:r>
+    </w:p>
+    <w:p>
+      <w:pPr>
+        <w:keepLines/>
+        <w:spacing w:after="180" w:line="252" w:lineRule="auto"/>
+        <w:ind w:left="403" w:hanging="403"/>
+      </w:pPr>
+      <w:r>
+        <w:rPr>
+          <w:sz w:val="20"/>
+        </w:rPr>
+        <w:t>[1] Marcel Theodor Wende. Minimal Carrier and Action-Scale Closure in the Balance–Field Framework. 22 September 2026. Especially Sections 2–8 and Appendix A.</w:t>
+      </w:r>
+    </w:p>
+    <w:p>
+      <w:pPr>
+        <w:keepLines/>
+        <w:spacing w:after="180" w:line="252" w:lineRule="auto"/>
+        <w:ind w:left="403" w:hanging="403"/>
+      </w:pPr>
+      <w:r>
+        <w:rPr>
+          <w:sz w:val="20"/>
+        </w:rPr>
+        <w:t>[2] Marcel Theodor Wende. BFG Neutral First Reclosure and the Conditions for Emergence. Integrated preprint with amended Level 0, revised 30 September 2026. Especially Section 2.</w:t>
+      </w:r>
+    </w:p>
+    <w:p>
+      <w:pPr>
+        <w:keepLines/>
+        <w:spacing w:after="180" w:line="252" w:lineRule="auto"/>
+        <w:ind w:left="403" w:hanging="403"/>
+      </w:pPr>
+      <w:r>
+        <w:rPr>
+          <w:sz w:val="20"/>
+        </w:rPr>
+        <w:t>[3] BFG G0 as a New Continuation Axiom. Justification and Mathematical Consequences of a Revised Neutral Feedback Rule. Prepared for Marcel Theodor Wende, 30 September 2026; with Closed BFG Dynamics with Separate Neutral Load and the unchanged module g0_model.py. Manuscript titles translated from German.</w:t>
+      </w:r>
+    </w:p>
+    <w:p>
+      <w:pPr>
+        <w:keepLines/>
+        <w:spacing w:after="180" w:line="252" w:lineRule="auto"/>
+        <w:ind w:left="403" w:hanging="403"/>
+      </w:pPr>
+      <w:r>
+        <w:rPr>
+          <w:sz w:val="20"/>
+        </w:rPr>
+        <w:t>[4] BFG Measurement Model with Neutral Continuation. Balance Coupling, Local Registration, and Conditional Outcome Probabilities. Prepared for Marcel Theodor Wende, 30 September 2026. Especially Sections 2, 4, and 5. Manuscript title translated from German.</w:t>
+      </w:r>
+    </w:p>
+    <w:p>
+      <w:pPr>
+        <w:keepLines/>
+        <w:spacing w:after="180" w:line="252" w:lineRule="auto"/>
+        <w:ind w:left="403" w:hanging="403"/>
+      </w:pPr>
+      <w:r>
+        <w:rPr>
+          <w:sz w:val="20"/>
         </w:rPr>
         <w:t>[5] Marcel Theodor Wende. BFG Natural-Emergence Benchmark and Capacity-Matched Null-Model Tournament. 9 September 2026. Quantum Mechanics section; a historical assessment, not an evaluation of later additions.</w:t>
+      </w:r>
+    </w:p>
+    <w:p>
+      <w:r>
+        <w:rPr>
+          <w:b/>
+        </w:rPr>
+        <w:t>External mathematical and historical sources</w:t>
+      </w:r>
+    </w:p>
+    <w:p>
+      <w:pPr>
+        <w:keepLines/>
+        <w:spacing w:after="180" w:line="252" w:lineRule="auto"/>
+        <w:ind w:left="403" w:hanging="403"/>
+      </w:pPr>
+      <w:r>
+        <w:rPr>
+          <w:sz w:val="20"/>
+        </w:rPr>
+        <w:t>[6] J. Watrous, The Theory of Quantum Information. Cambridge University Press, Cambridge, 2018. Chapter 1, especially the operator–vector correspondence and Schmidt decomposition.</w:t>
+      </w:r>
+      <w:r>
+        <w:t xml:space="preserve"> </w:t>
+      </w:r>
+      <w:hyperlink r:id="rId10">
+        <w:r>
+          <w:rPr>
+            <w:rFonts w:ascii="Cambria" w:hAnsi="Cambria"/>
+            <w:sz w:val="20"/>
+            <w:color w:val="000000"/>
+          </w:rPr>
+          <w:t>https://doi.org/10.1017/9781316848142</w:t>
+        </w:r>
+      </w:hyperlink>
+    </w:p>
+    <w:p>
+      <w:pPr>
+        <w:keepLines/>
+        <w:spacing w:after="180" w:line="252" w:lineRule="auto"/>
+        <w:ind w:left="403" w:hanging="403"/>
+      </w:pPr>
+      <w:r>
+        <w:rPr>
+          <w:sz w:val="20"/>
+        </w:rPr>
+        <w:t>[7] A. Einstein, B. Podolsky, and N. Rosen, “Can Quantum-Mechanical Description of Physical Reality Be Considered Complete?”, Physical Review 47, 777–780 (1935).</w:t>
+      </w:r>
+      <w:r>
+        <w:t xml:space="preserve"> </w:t>
+      </w:r>
+      <w:hyperlink r:id="rId11">
+        <w:r>
+          <w:rPr>
+            <w:rFonts w:ascii="Cambria" w:hAnsi="Cambria"/>
+            <w:sz w:val="20"/>
+            <w:color w:val="000000"/>
+          </w:rPr>
+          <w:t>https://doi.org/10.1103/PhysRev.47.777</w:t>
+        </w:r>
+      </w:hyperlink>
+    </w:p>
+    <w:p>
+      <w:pPr>
+        <w:keepLines/>
+        <w:spacing w:after="180" w:line="252" w:lineRule="auto"/>
+        <w:ind w:left="403" w:hanging="403"/>
+      </w:pPr>
+      <w:r>
+        <w:rPr>
+          <w:sz w:val="20"/>
+        </w:rPr>
+        <w:t>[8] E. Schrödinger, “Discussion of Probability Relations between Separated Systems”, Mathematical Proceedings of the Cambridge Philosophical Society 31(4), 555–563 (1935).</w:t>
+      </w:r>
+      <w:r>
+        <w:t xml:space="preserve"> </w:t>
+      </w:r>
+      <w:hyperlink r:id="rId12">
+        <w:r>
+          <w:rPr>
+            <w:rFonts w:ascii="Cambria" w:hAnsi="Cambria"/>
+            <w:sz w:val="20"/>
+            <w:color w:val="000000"/>
+          </w:rPr>
+          <w:t>https://doi.org/10.1017/S0305004100013554</w:t>
+        </w:r>
+      </w:hyperlink>
+    </w:p>
+    <w:p>
+      <w:r>
+        <w:br w:type="page"/>
+      </w:r>
+    </w:p>
+    <w:p>
+      <w:pPr>
+        <w:pStyle w:val="Heading1"/>
+      </w:pPr>
+      <w:r>
+        <w:t>References continued</w:t>
+      </w:r>
+    </w:p>
+    <w:p>
+      <w:r>
+        <w:rPr>
+          <w:b/>
+        </w:rPr>
+        <w:t>Bell correlations probability representation and physical tests</w:t>
+      </w:r>
+    </w:p>
+    <w:p>
+      <w:pPr>
+        <w:keepLines/>
+        <w:spacing w:after="180" w:line="252" w:lineRule="auto"/>
+        <w:ind w:left="403" w:hanging="403"/>
+      </w:pPr>
+      <w:r>
+        <w:rPr>
+          <w:sz w:val="20"/>
+        </w:rPr>
+        <w:t>[9] J. S. Bell, “On the Einstein Podolsky Rosen paradox”, Physics Physique Fizika 1, 195–200 (1964).</w:t>
+      </w:r>
+      <w:r>
+        <w:t xml:space="preserve"> </w:t>
+      </w:r>
+      <w:hyperlink r:id="rId13">
+        <w:r>
+          <w:rPr>
+            <w:rFonts w:ascii="Cambria" w:hAnsi="Cambria"/>
+            <w:sz w:val="20"/>
+            <w:color w:val="000000"/>
+          </w:rPr>
+          <w:t>https://doi.org/10.1103/PhysicsPhysiqueFizika.1.195</w:t>
+        </w:r>
+      </w:hyperlink>
+    </w:p>
+    <w:p>
+      <w:pPr>
+        <w:keepLines/>
+        <w:spacing w:after="180" w:line="252" w:lineRule="auto"/>
+        <w:ind w:left="403" w:hanging="403"/>
+      </w:pPr>
+      <w:r>
+        <w:rPr>
+          <w:sz w:val="20"/>
+        </w:rPr>
+        <w:t>[10] J. F. Clauser, M. A. Horne, A. Shimony, and R. A. Holt, “Proposed Experiment to Test Local Hidden-Variable Theories”, Physical Review Letters 23, 880–884 (1969).</w:t>
+      </w:r>
+      <w:r>
+        <w:t xml:space="preserve"> </w:t>
+      </w:r>
+      <w:hyperlink r:id="rId14">
+        <w:r>
+          <w:rPr>
+            <w:rFonts w:ascii="Cambria" w:hAnsi="Cambria"/>
+            <w:sz w:val="20"/>
+            <w:color w:val="000000"/>
+          </w:rPr>
+          <w:t>https://doi.org/10.1103/PhysRevLett.23.880</w:t>
+        </w:r>
+      </w:hyperlink>
+    </w:p>
+    <w:p>
+      <w:pPr>
+        <w:keepLines/>
+        <w:spacing w:after="180" w:line="252" w:lineRule="auto"/>
+        <w:ind w:left="403" w:hanging="403"/>
+      </w:pPr>
+      <w:r>
+        <w:rPr>
+          <w:sz w:val="20"/>
+        </w:rPr>
+        <w:t>[11] B. S. Cirel’son, “Quantum generalizations of Bell’s inequality”, Letters in Mathematical Physics 4, 93–100 (1980).</w:t>
+      </w:r>
+      <w:r>
+        <w:t xml:space="preserve"> </w:t>
+      </w:r>
+      <w:hyperlink r:id="rId15">
+        <w:r>
+          <w:rPr>
+            <w:rFonts w:ascii="Cambria" w:hAnsi="Cambria"/>
+            <w:sz w:val="20"/>
+            <w:color w:val="000000"/>
+          </w:rPr>
+          <w:t>https://doi.org/10.1007/BF00417500</w:t>
+        </w:r>
+      </w:hyperlink>
+    </w:p>
+    <w:p>
+      <w:pPr>
+        <w:keepLines/>
+        <w:spacing w:after="180" w:line="252" w:lineRule="auto"/>
+        <w:ind w:left="403" w:hanging="403"/>
+      </w:pPr>
+      <w:r>
+        <w:rPr>
+          <w:sz w:val="20"/>
+        </w:rPr>
+        <w:t>[12] R. F. Werner, “Quantum states with Einstein-Podolsky-Rosen correlations admitting a hidden-variable model”, Physical Review A 40, 4277–4281 (1989).</w:t>
+      </w:r>
+      <w:r>
+        <w:t xml:space="preserve"> </w:t>
+      </w:r>
+      <w:hyperlink r:id="rId16">
+        <w:r>
+          <w:rPr>
+            <w:rFonts w:ascii="Cambria" w:hAnsi="Cambria"/>
+            <w:sz w:val="20"/>
+            <w:color w:val="000000"/>
+          </w:rPr>
+          <w:t>https://doi.org/10.1103/PhysRevA.40.4277</w:t>
+        </w:r>
+      </w:hyperlink>
+    </w:p>
+    <w:p>
+      <w:pPr>
+        <w:keepLines/>
+        <w:spacing w:after="180" w:line="252" w:lineRule="auto"/>
+        <w:ind w:left="403" w:hanging="403"/>
+      </w:pPr>
+      <w:r>
+        <w:rPr>
+          <w:sz w:val="20"/>
+        </w:rPr>
+        <w:t>[13] A. M. Gleason, “Measures on the Closed Subspaces of a Hilbert Space”, Journal of Mathematics and Mechanics 6(6), 885–893 (1957).</w:t>
+      </w:r>
+      <w:r>
+        <w:t xml:space="preserve"> </w:t>
+      </w:r>
+      <w:hyperlink r:id="rId17">
+        <w:r>
+          <w:rPr>
+            <w:rFonts w:ascii="Cambria" w:hAnsi="Cambria"/>
+            <w:sz w:val="20"/>
+            <w:color w:val="000000"/>
+          </w:rPr>
+          <w:t>https://doi.org/10.1512/iumj.1957.6.56050</w:t>
+        </w:r>
+      </w:hyperlink>
+    </w:p>
+    <w:p>
+      <w:pPr>
+        <w:keepLines/>
+        <w:spacing w:after="180" w:line="252" w:lineRule="auto"/>
+        <w:ind w:left="403" w:hanging="403"/>
+      </w:pPr>
+      <w:r>
+        <w:rPr>
+          <w:sz w:val="20"/>
+        </w:rPr>
+        <w:t>[14] P. Busch, “Quantum States and Generalized Observables: A Simple Proof of Gleason’s Theorem”, Physical Review Letters 91, 120403 (2003).</w:t>
+      </w:r>
+      <w:r>
+        <w:t xml:space="preserve"> </w:t>
+      </w:r>
+      <w:hyperlink r:id="rId18">
+        <w:r>
+          <w:rPr>
+            <w:rFonts w:ascii="Cambria" w:hAnsi="Cambria"/>
+            <w:sz w:val="20"/>
+            <w:color w:val="000000"/>
+          </w:rPr>
+          <w:t>https://doi.org/10.1103/PhysRevLett.91.120403</w:t>
+        </w:r>
+      </w:hyperlink>
+    </w:p>
+    <w:p>
+      <w:pPr>
+        <w:keepLines/>
+        <w:spacing w:after="180" w:line="252" w:lineRule="auto"/>
+        <w:ind w:left="403" w:hanging="403"/>
+      </w:pPr>
+      <w:r>
+        <w:rPr>
+          <w:sz w:val="20"/>
+        </w:rPr>
+        <w:t>[15] B. Hensen et al., “Loophole-free Bell inequality violation using electron spins separated by 1.3 kilometres”, Nature 526, 682–686 (2015).</w:t>
+      </w:r>
+      <w:r>
+        <w:t xml:space="preserve"> </w:t>
+      </w:r>
+      <w:hyperlink r:id="rId19">
+        <w:r>
+          <w:rPr>
+            <w:rFonts w:ascii="Cambria" w:hAnsi="Cambria"/>
+            <w:sz w:val="20"/>
+            <w:color w:val="000000"/>
+          </w:rPr>
+          <w:t>https://doi.org/10.1038/nature15759</w:t>
+        </w:r>
+      </w:hyperlink>
+    </w:p>
+    <w:p>
+      <w:pPr>
+        <w:keepLines/>
+        <w:spacing w:after="180" w:line="252" w:lineRule="auto"/>
+        <w:ind w:left="403" w:hanging="403"/>
+      </w:pPr>
+      <w:r>
+        <w:rPr>
+          <w:sz w:val="20"/>
+        </w:rPr>
+        <w:t>[16] C. Marletto and V. Vedral, “Gravitationally Induced Entanglement between Two Massive Particles is Sufficient Evidence of Quantum Effects in Gravity”, Physical Review Letters 119, 240402 (2017).</w:t>
+      </w:r>
+      <w:r>
+        <w:t xml:space="preserve"> </w:t>
+      </w:r>
+      <w:hyperlink r:id="rId20">
+        <w:r>
+          <w:rPr>
+            <w:rFonts w:ascii="Cambria" w:hAnsi="Cambria"/>
+            <w:sz w:val="20"/>
+            <w:color w:val="000000"/>
+          </w:rPr>
+          <w:t>https://doi.org/10.1103/PhysRevLett.119.240402</w:t>
+        </w:r>
+      </w:hyperlink>
+    </w:p>
+    <w:p>
+      <w:r>
+        <w:rPr>
+          <w:b w:val="0"/>
+        </w:rPr>
+        <w:t>Bibliographic details and the cited primary-source material were checked online on 30 September 2026. Reference [6] is an academic monograph; [7]–[16] are journal articles. The accompanying references.json records the source links and the role of each external reference. References [1]–[5] retain their status as BFG development sources.</w:t>
       </w:r>
     </w:p>
     <w:sectPr>

</xml_diff>